<commit_message>
Render complete v0.6.1 reader and booklet rulebooks
</commit_message>
<xml_diff>
--- a/releases/v0.6.1/Gauntlet_v0.6.1_Reference_Guide.docx
+++ b/releases/v0.6.1/Gauntlet_v0.6.1_Reference_Guide.docx
@@ -2582,7 +2582,7 @@
       <w:headerReference r:id="rId9" w:type="default"/>
       <w:footerReference r:id="rId10" w:type="default"/>
       <w:pgSz w:h="15840" w:w="12240"/>
-      <w:pgMar w:bottom="893" w:footer="403" w:gutter="0" w:header="403" w:left="1037" w:right="1037" w:top="979"/>
+      <w:pgMar w:bottom="1008" w:footer="317" w:gutter="0" w:header="317" w:left="1008" w:right="1008" w:top="1008"/>
       <w:cols w:space="720"/>
       <w:docGrid w:linePitch="360"/>
     </w:sectPr>
@@ -2603,11 +2603,11 @@
     </w:pPr>
     <w:r>
       <w:rPr>
-        <w:rFonts w:ascii="Liberation Sans" w:hAnsi="Liberation Sans" w:eastAsia="Liberation Sans"/>
-        <w:color w:val="63564C"/>
-        <w:sz w:val="15"/>
-      </w:rPr>
-      <w:t xml:space="preserve">Gauntlet v0.6.1  |  First Playtest Revision  |  Page </w:t>
+        <w:rFonts w:ascii="Inter" w:hAnsi="Inter" w:eastAsia="Inter"/>
+        <w:color w:val="665F55"/>
+        <w:sz w:val="14"/>
+      </w:rPr>
+      <w:t xml:space="preserve">Gauntlet v0.6.1  |  Page </w:t>
     </w:r>
     <w:r>
       <w:fldChar w:fldCharType="begin"/>
@@ -2646,10 +2646,10 @@
     </w:pPr>
     <w:r>
       <w:rPr>
-        <w:rFonts w:ascii="Liberation Sans" w:hAnsi="Liberation Sans" w:eastAsia="Liberation Sans"/>
-        <w:b/>
-        <w:color w:val="63564C"/>
-        <w:sz w:val="15"/>
+        <w:rFonts w:ascii="Inter" w:hAnsi="Inter" w:eastAsia="Inter"/>
+        <w:b/>
+        <w:color w:val="665F55"/>
+        <w:sz w:val="14"/>
       </w:rPr>
       <w:t>GAUNTLET  |  REFERENCE GUIDE  |  v0.6.1</w:t>
     </w:r>
@@ -3432,11 +3432,11 @@
     <w:qFormat/>
     <w:rsid w:val="00FC693F"/>
     <w:pPr>
-      <w:spacing w:after="110" w:line="252" w:lineRule="auto"/>
+      <w:spacing w:after="96" w:line="250" w:lineRule="auto"/>
     </w:pPr>
     <w:rPr>
-      <w:rFonts w:ascii="Liberation Sans" w:eastAsia="Liberation Sans" w:hAnsi="Liberation Sans"/>
-      <w:color w:val="241B17"/>
+      <w:rFonts w:ascii="Adobe Caslon Pro" w:eastAsia="Adobe Caslon Pro" w:hAnsi="Adobe Caslon Pro"/>
+      <w:color w:val="181614"/>
       <w:sz w:val="20"/>
     </w:rPr>
   </w:style>
@@ -3495,14 +3495,14 @@
     <w:pPr>
       <w:keepNext/>
       <w:keepLines/>
-      <w:spacing w:after="120" w:before="300"/>
+      <w:spacing w:after="120" w:before="280"/>
       <w:outlineLvl w:val="0"/>
     </w:pPr>
     <w:rPr>
-      <w:rFonts w:ascii="Liberation Serif" w:asciiTheme="majorHAnsi" w:cstheme="majorBidi" w:eastAsia="Liberation Serif" w:eastAsiaTheme="majorEastAsia" w:hAnsi="Liberation Serif" w:hAnsiTheme="majorHAnsi"/>
-      <w:b/>
+      <w:rFonts w:ascii="Georgia" w:asciiTheme="majorHAnsi" w:cstheme="majorBidi" w:eastAsia="Georgia" w:eastAsiaTheme="majorEastAsia" w:hAnsi="Georgia" w:hAnsiTheme="majorHAnsi"/>
+      <w:b w:val="0"/>
       <w:bCs/>
-      <w:color w:val="6F3518"/>
+      <w:color w:val="5F1418"/>
       <w:sz w:val="36"/>
       <w:szCs w:val="28"/>
     </w:rPr>
@@ -3519,14 +3519,14 @@
     <w:pPr>
       <w:keepNext/>
       <w:keepLines/>
-      <w:spacing w:after="80" w:before="220"/>
+      <w:spacing w:after="80" w:before="200"/>
       <w:outlineLvl w:val="1"/>
     </w:pPr>
     <w:rPr>
-      <w:rFonts w:ascii="Liberation Serif" w:asciiTheme="majorHAnsi" w:cstheme="majorBidi" w:eastAsia="Liberation Serif" w:eastAsiaTheme="majorEastAsia" w:hAnsi="Liberation Serif" w:hAnsiTheme="majorHAnsi"/>
+      <w:rFonts w:ascii="Georgia" w:asciiTheme="majorHAnsi" w:cstheme="majorBidi" w:eastAsia="Georgia" w:eastAsiaTheme="majorEastAsia" w:hAnsi="Georgia" w:hAnsiTheme="majorHAnsi"/>
       <w:b/>
       <w:bCs/>
-      <w:color w:val="6F3518"/>
+      <w:color w:val="5F1418"/>
       <w:sz w:val="28"/>
       <w:szCs w:val="26"/>
     </w:rPr>
@@ -3547,11 +3547,11 @@
       <w:outlineLvl w:val="2"/>
     </w:pPr>
     <w:rPr>
-      <w:rFonts w:ascii="Liberation Sans" w:asciiTheme="majorHAnsi" w:cstheme="majorBidi" w:eastAsia="Liberation Sans" w:eastAsiaTheme="majorEastAsia" w:hAnsi="Liberation Sans" w:hAnsiTheme="majorHAnsi"/>
+      <w:rFonts w:ascii="Adobe Caslon Pro" w:asciiTheme="majorHAnsi" w:cstheme="majorBidi" w:eastAsia="Adobe Caslon Pro" w:eastAsiaTheme="majorEastAsia" w:hAnsi="Adobe Caslon Pro" w:hAnsiTheme="majorHAnsi"/>
       <w:b/>
       <w:bCs/>
-      <w:color w:val="6F3518"/>
-      <w:sz w:val="23"/>
+      <w:color w:val="5F1418"/>
+      <w:sz w:val="22"/>
     </w:rPr>
   </w:style>
   <w:style w:styleId="Heading4" w:type="paragraph">
@@ -3785,16 +3785,16 @@
       <w:pBdr>
         <w:bottom w:color="4F81BD" w:space="4" w:sz="8" w:themeColor="accent1" w:val="single"/>
       </w:pBdr>
-      <w:spacing w:after="200" w:line="240" w:lineRule="auto"/>
+      <w:spacing w:after="180" w:line="240" w:lineRule="auto"/>
       <w:contextualSpacing/>
     </w:pPr>
     <w:rPr>
-      <w:rFonts w:ascii="Liberation Serif" w:asciiTheme="majorHAnsi" w:cstheme="majorBidi" w:eastAsia="Liberation Serif" w:eastAsiaTheme="majorEastAsia" w:hAnsi="Liberation Serif" w:hAnsiTheme="majorHAnsi"/>
-      <w:b/>
-      <w:color w:val="6F3518"/>
+      <w:rFonts w:ascii="P22 1722 Pro" w:asciiTheme="majorHAnsi" w:cstheme="majorBidi" w:eastAsia="P22 1722 Pro" w:eastAsiaTheme="majorEastAsia" w:hAnsi="P22 1722 Pro" w:hAnsiTheme="majorHAnsi"/>
+      <w:b w:val="0"/>
+      <w:color w:val="5F1418"/>
       <w:spacing w:val="5"/>
       <w:kern w:val="28"/>
-      <w:sz w:val="54"/>
+      <w:sz w:val="56"/>
       <w:szCs w:val="52"/>
     </w:rPr>
   </w:style>
@@ -3825,15 +3825,15 @@
       <w:numPr>
         <w:ilvl w:val="1"/>
       </w:numPr>
-      <w:spacing w:after="200"/>
+      <w:spacing w:after="180"/>
     </w:pPr>
     <w:rPr>
-      <w:rFonts w:ascii="Liberation Sans" w:asciiTheme="majorHAnsi" w:cstheme="majorBidi" w:eastAsia="Liberation Sans" w:eastAsiaTheme="majorEastAsia" w:hAnsi="Liberation Sans" w:hAnsiTheme="majorHAnsi"/>
+      <w:rFonts w:ascii="Inter" w:asciiTheme="majorHAnsi" w:cstheme="majorBidi" w:eastAsia="Inter" w:eastAsiaTheme="majorEastAsia" w:hAnsi="Inter" w:hAnsiTheme="majorHAnsi"/>
       <w:i/>
       <w:iCs/>
-      <w:color w:val="63564C"/>
+      <w:color w:val="665F55"/>
       <w:spacing w:val="15"/>
-      <w:sz w:val="24"/>
+      <w:sz w:val="21"/>
       <w:szCs w:val="24"/>
     </w:rPr>
   </w:style>
@@ -3969,11 +3969,11 @@
       <w:numPr>
         <w:numId w:val="1"/>
       </w:numPr>
-      <w:spacing w:after="50"/>
+      <w:spacing w:after="44"/>
       <w:contextualSpacing/>
     </w:pPr>
     <w:rPr>
-      <w:rFonts w:ascii="Liberation Sans" w:eastAsia="Liberation Sans" w:hAnsi="Liberation Sans"/>
+      <w:rFonts w:ascii="Adobe Caslon Pro" w:eastAsia="Adobe Caslon Pro" w:hAnsi="Adobe Caslon Pro"/>
       <w:sz w:val="20"/>
     </w:rPr>
   </w:style>
@@ -4013,11 +4013,11 @@
       <w:numPr>
         <w:numId w:val="5"/>
       </w:numPr>
-      <w:spacing w:after="50"/>
+      <w:spacing w:after="44"/>
       <w:contextualSpacing/>
     </w:pPr>
     <w:rPr>
-      <w:rFonts w:ascii="Liberation Sans" w:eastAsia="Liberation Sans" w:hAnsi="Liberation Sans"/>
+      <w:rFonts w:ascii="Adobe Caslon Pro" w:eastAsia="Adobe Caslon Pro" w:hAnsi="Adobe Caslon Pro"/>
       <w:sz w:val="20"/>
     </w:rPr>
   </w:style>
@@ -4127,14 +4127,14 @@
     <w:qFormat/>
     <w:rsid w:val="00FC693F"/>
     <w:pPr>
-      <w:spacing w:after="120" w:before="80"/>
-      <w:ind w:left="360" w:right="216"/>
+      <w:spacing w:after="100" w:before="80"/>
+      <w:ind w:left="288" w:right="173"/>
     </w:pPr>
     <w:rPr>
-      <w:rFonts w:ascii="Liberation Serif" w:eastAsia="Liberation Serif" w:hAnsi="Liberation Serif"/>
-      <w:i w:val="0"/>
+      <w:rFonts w:ascii="Adobe Caslon Pro" w:eastAsia="Adobe Caslon Pro" w:hAnsi="Adobe Caslon Pro"/>
+      <w:i/>
       <w:iCs/>
-      <w:color w:val="241B17"/>
+      <w:color w:val="181614"/>
       <w:sz w:val="20"/>
     </w:rPr>
   </w:style>
@@ -15144,16 +15144,9 @@
   <w:style w:customStyle="1" w:styleId="Table" w:type="table">
     <w:name w:val="Table"/>
     <w:rPr>
-      <w:rFonts w:ascii="Liberation Sans" w:eastAsia="Liberation Sans" w:hAnsi="Liberation Sans"/>
+      <w:rFonts w:ascii="Inter" w:eastAsia="Inter" w:hAnsi="Inter"/>
       <w:sz w:val="17"/>
     </w:rPr>
-  </w:style>
-  <w:style w:customStyle="1" w:styleId="Compact" w:type="paragraph">
-    <w:name w:val="Compact"/>
-    <w:basedOn w:val="Normal"/>
-    <w:pPr>
-      <w:spacing w:after="30"/>
-    </w:pPr>
   </w:style>
   <w:style w:type="paragraph" w:customStyle="1" w:styleId="SourceCode">
     <w:name w:val="Source Code"/>

</xml_diff>